<commit_message>
feat: simplify kisi-kisi schema, authoritative SSO role sync, and dedicated exam participant modal
- Remove deprecated KD/CP columns (nomor_kd, kd_cp) from cbt_question_kisi_kisi, DTOs, import/export, and Word templates
- Enforce authoritative SSO role sync from organization memberships and SSO ticket, removing stale user_metadata fallbacks
- Implement SSO front-channel logout route to clear session cookies
- Separate participant assignment in CreateExamModal into dedicated AssignExamModal with summary card and dual-mode sync
- Add database migration 20260930_01_remove_kisi_kd_columns.sql and sso-authoritative-role-sync test suite
</commit_message>
<xml_diff>
--- a/apps/web/public/template_soal_kepribadian.docx
+++ b/apps/web/public/template_soal_kepribadian.docx
@@ -6206,7 +6206,7 @@
       <w:rPr>
         <w:b/>
         <w:bCs/>
-        <w:color w:val="1E3A5F"/>
+        <w:color w:val="1E3A8A"/>
         <w:sz w:val="24"/>
         <w:szCs w:val="24"/>
       </w:rPr>
@@ -6216,7 +6216,7 @@
       <w:rPr>
         <w:b/>
         <w:bCs/>
-        <w:color w:val="1E3A5F"/>
+        <w:color w:val="1E3A8A"/>
         <w:sz w:val="24"/>
         <w:szCs w:val="24"/>
       </w:rPr>
@@ -6282,7 +6282,7 @@
             </w:rPr>
             <w:drawing>
               <wp:inline distT="0" distB="0" distL="0" distR="0" wp14:anchorId="2FC2AECA" wp14:editId="026DEA71">
-                <wp:extent cx="1512789" cy="297180"/>
+                <wp:extent cx="1714500" cy="304800"/>
                 <wp:effectExtent l="0" t="0" r="0" b="7620"/>
                 <wp:docPr id="870639523" name="Picture 1"/>
                 <wp:cNvGraphicFramePr>

</xml_diff>

<commit_message>
fix: fix image preview rendering, editor tabulation consistency, and word import templates
- Render draft/unsaved questions and uploaded images properly in PreviewModal

- Add custom Tab node and normalizeTabs to TipTap editor to preserve 8-char tabulation consistently across editor and exam preview

- Update Word import templates: map instruction column to question number and remove answer key guide

- Add storage file proxy and ensure media URIs pass DOMPurify sanitization
</commit_message>
<xml_diff>
--- a/apps/web/public/template_soal_kepribadian.docx
+++ b/apps/web/public/template_soal_kepribadian.docx
@@ -4001,7 +4001,7 @@
               <w:rPr>
                 <w:color w:val="1E293B"/>
               </w:rPr>
-              <w:t>1,2,3</w:t>
+              <w:t>1</w:t>
             </w:r>
           </w:p>
         </w:tc>
@@ -4158,7 +4158,7 @@
               <w:rPr>
                 <w:color w:val="1E293B"/>
               </w:rPr>
-              <w:t>4</w:t>
+              <w:t>2,3</w:t>
             </w:r>
           </w:p>
         </w:tc>
@@ -4287,7 +4287,7 @@
               <w:rPr>
                 <w:color w:val="1E293B"/>
               </w:rPr>
-              <w:t>5</w:t>
+              <w:t>4</w:t>
             </w:r>
           </w:p>
         </w:tc>
@@ -4402,7 +4402,7 @@
               <w:rPr>
                 <w:color w:val="1E293B"/>
               </w:rPr>
-              <w:t>6</w:t>
+              <w:t>5</w:t>
             </w:r>
           </w:p>
         </w:tc>
@@ -4545,7 +4545,7 @@
               <w:rPr>
                 <w:color w:val="1E293B"/>
               </w:rPr>
-              <w:t>7</w:t>
+              <w:t>6</w:t>
             </w:r>
           </w:p>
         </w:tc>
@@ -4712,6 +4712,12 @@
             <w:pPr>
               <w:jc w:val="center"/>
             </w:pPr>
+            <w:r>
+              <w:rPr>
+                <w:color w:val="1E293B"/>
+              </w:rPr>
+              <w:t>7</w:t>
+            </w:r>
           </w:p>
         </w:tc>
         <w:tc>

</xml_diff>

<commit_message>
Polish question editor modals, media validation and Word import templates
</commit_message>
<xml_diff>
--- a/apps/web/public/template_soal_kepribadian.docx
+++ b/apps/web/public/template_soal_kepribadian.docx
@@ -15,7 +15,7 @@
           <w:sz w:val="28"/>
           <w:szCs w:val="28"/>
         </w:rPr>
-        <w:t xml:space="preserve">TEMPLATE IMPORT SOAL </w:t>
+        <w:t xml:space="preserve">Template Soal Kepribadian</w:t>
       </w:r>
       <w:r>
         <w:rPr>
@@ -35,7 +35,7 @@
           <w:sz w:val="24"/>
           <w:szCs w:val="24"/>
         </w:rPr>
-        <w:t>(</w:t>
+        <w:t/>
       </w:r>
       <w:r>
         <w:rPr>
@@ -45,7 +45,7 @@
           <w:sz w:val="24"/>
           <w:szCs w:val="24"/>
         </w:rPr>
-        <w:t>KEPRIBADIAN</w:t>
+        <w:t/>
       </w:r>
       <w:r>
         <w:rPr>
@@ -55,7 +55,7 @@
           <w:sz w:val="24"/>
           <w:szCs w:val="24"/>
         </w:rPr>
-        <w:t>)</w:t>
+        <w:t/>
       </w:r>
     </w:p>
     <w:p>
@@ -3881,9 +3881,9 @@
         <w:tblLook w:val="0000" w:firstRow="0" w:lastRow="0" w:firstColumn="0" w:lastColumn="0" w:noHBand="0" w:noVBand="0"/>
       </w:tblPr>
       <w:tblGrid>
-        <w:gridCol w:w="898"/>
-        <w:gridCol w:w="1570"/>
-        <w:gridCol w:w="7628"/>
+        <w:gridCol w:w="909"/>
+        <w:gridCol w:w="2524"/>
+        <w:gridCol w:w="6663"/>
       </w:tblGrid>
       <w:tr>
         <w:trPr>
@@ -3892,7 +3892,7 @@
         </w:trPr>
         <w:tc>
           <w:tcPr>
-            <w:tcW w:w="800" w:type="dxa"/>
+            <w:tcW w:w="909" w:type="dxa"/>
             <w:tcBorders>
               <w:top w:val="single" w:sz="4" w:space="0" w:color="BBBBBB"/>
               <w:left w:val="single" w:sz="4" w:space="0" w:color="BBBBBB"/>
@@ -3928,7 +3928,7 @@
         </w:tc>
         <w:tc>
           <w:tcPr>
-            <w:tcW w:w="1400" w:type="dxa"/>
+            <w:tcW w:w="2524" w:type="dxa"/>
             <w:tcBorders>
               <w:top w:val="single" w:sz="4" w:space="0" w:color="BBBBBB"/>
               <w:left w:val="single" w:sz="4" w:space="0" w:color="BBBBBB"/>
@@ -3956,7 +3956,7 @@
         </w:tc>
         <w:tc>
           <w:tcPr>
-            <w:tcW w:w="6800" w:type="dxa"/>
+            <w:tcW w:w="6663" w:type="dxa"/>
             <w:tcBorders>
               <w:top w:val="single" w:sz="4" w:space="0" w:color="BBBBBB"/>
               <w:left w:val="single" w:sz="4" w:space="0" w:color="BBBBBB"/>
@@ -3984,7 +3984,7 @@
       <w:tr>
         <w:tc>
           <w:tcPr>
-            <w:tcW w:w="800" w:type="dxa"/>
+            <w:tcW w:w="909" w:type="dxa"/>
             <w:tcBorders>
               <w:top w:val="single" w:sz="4" w:space="0" w:color="BBBBBB"/>
               <w:left w:val="single" w:sz="4" w:space="0" w:color="BBBBBB"/>
@@ -4007,7 +4007,7 @@
         </w:tc>
         <w:tc>
           <w:tcPr>
-            <w:tcW w:w="1400" w:type="dxa"/>
+            <w:tcW w:w="2524" w:type="dxa"/>
             <w:tcBorders>
               <w:top w:val="single" w:sz="4" w:space="0" w:color="BBBBBB"/>
               <w:left w:val="single" w:sz="4" w:space="0" w:color="BBBBBB"/>
@@ -4027,7 +4027,7 @@
         </w:tc>
         <w:tc>
           <w:tcPr>
-            <w:tcW w:w="6800" w:type="dxa"/>
+            <w:tcW w:w="6663" w:type="dxa"/>
             <w:tcBorders>
               <w:top w:val="single" w:sz="4" w:space="0" w:color="BBBBBB"/>
               <w:left w:val="single" w:sz="4" w:space="0" w:color="BBBBBB"/>
@@ -4141,7 +4141,7 @@
       <w:tr>
         <w:tc>
           <w:tcPr>
-            <w:tcW w:w="800" w:type="dxa"/>
+            <w:tcW w:w="909" w:type="dxa"/>
             <w:tcBorders>
               <w:top w:val="single" w:sz="4" w:space="0" w:color="BBBBBB"/>
               <w:left w:val="single" w:sz="4" w:space="0" w:color="BBBBBB"/>
@@ -4164,7 +4164,7 @@
         </w:tc>
         <w:tc>
           <w:tcPr>
-            <w:tcW w:w="1400" w:type="dxa"/>
+            <w:tcW w:w="2524" w:type="dxa"/>
             <w:tcBorders>
               <w:top w:val="single" w:sz="4" w:space="0" w:color="BBBBBB"/>
               <w:left w:val="single" w:sz="4" w:space="0" w:color="BBBBBB"/>
@@ -4184,7 +4184,7 @@
         </w:tc>
         <w:tc>
           <w:tcPr>
-            <w:tcW w:w="6800" w:type="dxa"/>
+            <w:tcW w:w="6663" w:type="dxa"/>
             <w:tcBorders>
               <w:top w:val="single" w:sz="4" w:space="0" w:color="BBBBBB"/>
               <w:left w:val="single" w:sz="4" w:space="0" w:color="BBBBBB"/>
@@ -4270,7 +4270,7 @@
       <w:tr>
         <w:tc>
           <w:tcPr>
-            <w:tcW w:w="800" w:type="dxa"/>
+            <w:tcW w:w="909" w:type="dxa"/>
             <w:tcBorders>
               <w:top w:val="single" w:sz="4" w:space="0" w:color="BBBBBB"/>
               <w:left w:val="single" w:sz="4" w:space="0" w:color="BBBBBB"/>
@@ -4293,7 +4293,7 @@
         </w:tc>
         <w:tc>
           <w:tcPr>
-            <w:tcW w:w="1400" w:type="dxa"/>
+            <w:tcW w:w="2524" w:type="dxa"/>
             <w:tcBorders>
               <w:top w:val="single" w:sz="4" w:space="0" w:color="BBBBBB"/>
               <w:left w:val="single" w:sz="4" w:space="0" w:color="BBBBBB"/>
@@ -4313,7 +4313,7 @@
         </w:tc>
         <w:tc>
           <w:tcPr>
-            <w:tcW w:w="6800" w:type="dxa"/>
+            <w:tcW w:w="6663" w:type="dxa"/>
             <w:tcBorders>
               <w:top w:val="single" w:sz="4" w:space="0" w:color="BBBBBB"/>
               <w:left w:val="single" w:sz="4" w:space="0" w:color="BBBBBB"/>
@@ -4385,7 +4385,7 @@
       <w:tr>
         <w:tc>
           <w:tcPr>
-            <w:tcW w:w="800" w:type="dxa"/>
+            <w:tcW w:w="909" w:type="dxa"/>
             <w:tcBorders>
               <w:top w:val="single" w:sz="4" w:space="0" w:color="BBBBBB"/>
               <w:left w:val="single" w:sz="4" w:space="0" w:color="BBBBBB"/>
@@ -4408,7 +4408,7 @@
         </w:tc>
         <w:tc>
           <w:tcPr>
-            <w:tcW w:w="1400" w:type="dxa"/>
+            <w:tcW w:w="2524" w:type="dxa"/>
             <w:tcBorders>
               <w:top w:val="single" w:sz="4" w:space="0" w:color="BBBBBB"/>
               <w:left w:val="single" w:sz="4" w:space="0" w:color="BBBBBB"/>
@@ -4428,7 +4428,7 @@
         </w:tc>
         <w:tc>
           <w:tcPr>
-            <w:tcW w:w="6800" w:type="dxa"/>
+            <w:tcW w:w="6663" w:type="dxa"/>
             <w:tcBorders>
               <w:top w:val="single" w:sz="4" w:space="0" w:color="BBBBBB"/>
               <w:left w:val="single" w:sz="4" w:space="0" w:color="BBBBBB"/>
@@ -4528,7 +4528,7 @@
       <w:tr>
         <w:tc>
           <w:tcPr>
-            <w:tcW w:w="800" w:type="dxa"/>
+            <w:tcW w:w="909" w:type="dxa"/>
             <w:tcBorders>
               <w:top w:val="single" w:sz="4" w:space="0" w:color="BBBBBB"/>
               <w:left w:val="single" w:sz="4" w:space="0" w:color="BBBBBB"/>
@@ -4551,7 +4551,7 @@
         </w:tc>
         <w:tc>
           <w:tcPr>
-            <w:tcW w:w="1400" w:type="dxa"/>
+            <w:tcW w:w="2524" w:type="dxa"/>
             <w:tcBorders>
               <w:top w:val="single" w:sz="4" w:space="0" w:color="BBBBBB"/>
               <w:left w:val="single" w:sz="4" w:space="0" w:color="BBBBBB"/>
@@ -4571,7 +4571,7 @@
         </w:tc>
         <w:tc>
           <w:tcPr>
-            <w:tcW w:w="6800" w:type="dxa"/>
+            <w:tcW w:w="6663" w:type="dxa"/>
             <w:tcBorders>
               <w:top w:val="single" w:sz="4" w:space="0" w:color="BBBBBB"/>
               <w:left w:val="single" w:sz="4" w:space="0" w:color="BBBBBB"/>
@@ -4699,7 +4699,7 @@
       <w:tr>
         <w:tc>
           <w:tcPr>
-            <w:tcW w:w="800" w:type="dxa"/>
+            <w:tcW w:w="909" w:type="dxa"/>
             <w:tcBorders>
               <w:top w:val="single" w:sz="4" w:space="0" w:color="BBBBBB"/>
               <w:left w:val="single" w:sz="4" w:space="0" w:color="BBBBBB"/>
@@ -4722,7 +4722,7 @@
         </w:tc>
         <w:tc>
           <w:tcPr>
-            <w:tcW w:w="1400" w:type="dxa"/>
+            <w:tcW w:w="2524" w:type="dxa"/>
             <w:tcBorders>
               <w:top w:val="single" w:sz="4" w:space="0" w:color="BBBBBB"/>
               <w:left w:val="single" w:sz="4" w:space="0" w:color="BBBBBB"/>
@@ -4742,7 +4742,7 @@
         </w:tc>
         <w:tc>
           <w:tcPr>
-            <w:tcW w:w="6800" w:type="dxa"/>
+            <w:tcW w:w="6663" w:type="dxa"/>
             <w:tcBorders>
               <w:top w:val="single" w:sz="4" w:space="0" w:color="BBBBBB"/>
               <w:left w:val="single" w:sz="4" w:space="0" w:color="BBBBBB"/>
@@ -4880,9 +4880,9 @@
         <w:tblLook w:val="0000" w:firstRow="0" w:lastRow="0" w:firstColumn="0" w:lastColumn="0" w:noHBand="0" w:noVBand="0"/>
       </w:tblPr>
       <w:tblGrid>
-        <w:gridCol w:w="898"/>
-        <w:gridCol w:w="1570"/>
-        <w:gridCol w:w="7628"/>
+        <w:gridCol w:w="909"/>
+        <w:gridCol w:w="2524"/>
+        <w:gridCol w:w="6663"/>
       </w:tblGrid>
       <w:tr>
         <w:trPr>
@@ -4891,7 +4891,7 @@
         </w:trPr>
         <w:tc>
           <w:tcPr>
-            <w:tcW w:w="800" w:type="dxa"/>
+            <w:tcW w:w="909" w:type="dxa"/>
             <w:tcBorders>
               <w:top w:val="single" w:sz="4" w:space="0" w:color="BBBBBB"/>
               <w:left w:val="single" w:sz="4" w:space="0" w:color="BBBBBB"/>
@@ -4927,7 +4927,7 @@
         </w:tc>
         <w:tc>
           <w:tcPr>
-            <w:tcW w:w="1400" w:type="dxa"/>
+            <w:tcW w:w="2524" w:type="dxa"/>
             <w:tcBorders>
               <w:top w:val="single" w:sz="4" w:space="0" w:color="BBBBBB"/>
               <w:left w:val="single" w:sz="4" w:space="0" w:color="BBBBBB"/>
@@ -4955,7 +4955,7 @@
         </w:tc>
         <w:tc>
           <w:tcPr>
-            <w:tcW w:w="6800" w:type="dxa"/>
+            <w:tcW w:w="6663" w:type="dxa"/>
             <w:tcBorders>
               <w:top w:val="single" w:sz="4" w:space="0" w:color="BBBBBB"/>
               <w:left w:val="single" w:sz="4" w:space="0" w:color="BBBBBB"/>
@@ -4983,7 +4983,7 @@
       <w:tr>
         <w:tc>
           <w:tcPr>
-            <w:tcW w:w="800" w:type="dxa"/>
+            <w:tcW w:w="909" w:type="dxa"/>
             <w:tcBorders>
               <w:top w:val="single" w:sz="4" w:space="0" w:color="BBBBBB"/>
               <w:left w:val="single" w:sz="4" w:space="0" w:color="BBBBBB"/>
@@ -5006,7 +5006,7 @@
         </w:tc>
         <w:tc>
           <w:tcPr>
-            <w:tcW w:w="1400" w:type="dxa"/>
+            <w:tcW w:w="2524" w:type="dxa"/>
             <w:tcBorders>
               <w:top w:val="single" w:sz="4" w:space="0" w:color="BBBBBB"/>
               <w:left w:val="single" w:sz="4" w:space="0" w:color="BBBBBB"/>
@@ -5042,7 +5042,7 @@
         </w:tc>
         <w:tc>
           <w:tcPr>
-            <w:tcW w:w="6800" w:type="dxa"/>
+            <w:tcW w:w="6663" w:type="dxa"/>
             <w:tcBorders>
               <w:top w:val="single" w:sz="4" w:space="0" w:color="BBBBBB"/>
               <w:left w:val="single" w:sz="4" w:space="0" w:color="BBBBBB"/>

</xml_diff>